<commit_message>
Batch 4: 1 files
</commit_message>
<xml_diff>
--- a/jambo_sphere_pos.docx
+++ b/jambo_sphere_pos.docx
@@ -166,6 +166,48 @@
     </w:p>
     <w:p>
       <w:pPr>
+        <w:pStyle w:val="ListParagraph"/>
+        <w:numPr>
+          <w:ilvl w:val="0"/>
+          <w:numId w:val="2"/>
+        </w:numPr>
+        <w:spacing w:after="40" w:before="40"/>
+      </w:pPr>
+      <w:r>
+        <w:rPr>
+          <w:rFonts w:ascii="Arial" w:cs="Arial" w:eastAsia="Arial" w:hAnsi="Arial"/>
+          <w:b w:val="false"/>
+          <w:bCs w:val="false"/>
+          <w:color w:val="1A1A2E"/>
+          <w:sz w:val="20"/>
+          <w:szCs w:val="20"/>
+        </w:rPr>
+        <w:t xml:space="preserve">Progressive Web App (PWA) support — installable from the browser</w:t>
+      </w:r>
+    </w:p>
+    <w:p>
+      <w:pPr>
+        <w:pStyle w:val="ListParagraph"/>
+        <w:numPr>
+          <w:ilvl w:val="0"/>
+          <w:numId w:val="2"/>
+        </w:numPr>
+        <w:spacing w:after="40" w:before="40"/>
+      </w:pPr>
+      <w:r>
+        <w:rPr>
+          <w:rFonts w:ascii="Arial" w:cs="Arial" w:eastAsia="Arial" w:hAnsi="Arial"/>
+          <w:b w:val="false"/>
+          <w:bCs w:val="false"/>
+          <w:color w:val="1A1A2E"/>
+          <w:sz w:val="20"/>
+          <w:szCs w:val="20"/>
+        </w:rPr>
+        <w:t xml:space="preserve">Offline capability for cached pages via service worker</w:t>
+      </w:r>
+    </w:p>
+    <w:p>
+      <w:pPr>
         <w:spacing w:after="40" w:before="100"/>
       </w:pPr>
     </w:p>
@@ -1035,6 +1077,351 @@
         </w:rPr>
         <w:t xml:space="preserve">The system is structured to allow future expansion — payments, receipt generation, inventory tracking, and role permissions.</w:t>
       </w:r>
+    </w:p>
+    <w:p>
+      <w:pPr>
+        <w:spacing w:after="60" w:before="80"/>
+      </w:pPr>
+    </w:p>
+    <w:p>
+      <w:pPr>
+        <w:pBdr>
+          <w:bottom w:val="single" w:sz="4" w:space="1" w:color="D0DCF0"/>
+        </w:pBdr>
+        <w:spacing w:after="120" w:before="120"/>
+      </w:pPr>
+    </w:p>
+    <w:p>
+      <w:pPr>
+        <w:pStyle w:val="Heading1"/>
+        <w:spacing w:after="120" w:before="280"/>
+      </w:pPr>
+      <w:r>
+        <w:rPr>
+          <w:rFonts w:ascii="Arial" w:cs="Arial" w:eastAsia="Arial" w:hAnsi="Arial"/>
+          <w:b/>
+          <w:bCs/>
+          <w:color w:val="1A56A0"/>
+          <w:sz w:val="30"/>
+          <w:szCs w:val="30"/>
+        </w:rPr>
+        <w:t xml:space="preserve">PWA and Offline Capability</w:t>
+      </w:r>
+    </w:p>
+    <w:p>
+      <w:pPr>
+        <w:spacing w:after="60" w:before="60"/>
+      </w:pPr>
+      <w:r>
+        <w:rPr>
+          <w:rFonts w:ascii="Arial" w:cs="Arial" w:eastAsia="Arial" w:hAnsi="Arial"/>
+          <w:color w:val="1A1A2E"/>
+          <w:sz w:val="20"/>
+          <w:szCs w:val="20"/>
+        </w:rPr>
+        <w:t xml:space="preserve">This project includes Progressive Web App (PWA) support, allowing users to install the app and access cached screens when internet or server connectivity is unavailable.</w:t>
+      </w:r>
+    </w:p>
+    <w:p>
+      <w:pPr>
+        <w:pStyle w:val="Heading2"/>
+        <w:spacing w:after="80" w:before="220"/>
+      </w:pPr>
+      <w:r>
+        <w:rPr>
+          <w:rFonts w:ascii="Arial" w:cs="Arial" w:eastAsia="Arial" w:hAnsi="Arial"/>
+          <w:b/>
+          <w:bCs/>
+          <w:color w:val="2E86C1"/>
+          <w:sz w:val="24"/>
+          <w:szCs w:val="24"/>
+        </w:rPr>
+        <w:t xml:space="preserve">Install / Download the PWA</w:t>
+      </w:r>
+    </w:p>
+    <w:p>
+      <w:pPr>
+        <w:pStyle w:val="ListParagraph"/>
+        <w:numPr>
+          <w:ilvl w:val="0"/>
+          <w:numId w:val="3"/>
+        </w:numPr>
+        <w:spacing w:after="40" w:before="40"/>
+      </w:pPr>
+      <w:r>
+        <w:rPr>
+          <w:rFonts w:ascii="Arial" w:cs="Arial" w:eastAsia="Arial" w:hAnsi="Arial"/>
+          <w:color w:val="1A1A2E"/>
+          <w:sz w:val="20"/>
+          <w:szCs w:val="20"/>
+        </w:rPr>
+        <w:t xml:space="preserve">Start the Django server.</w:t>
+      </w:r>
+    </w:p>
+    <w:p>
+      <w:pPr>
+        <w:pStyle w:val="ListParagraph"/>
+        <w:numPr>
+          <w:ilvl w:val="0"/>
+          <w:numId w:val="3"/>
+        </w:numPr>
+        <w:spacing w:after="40" w:before="40"/>
+      </w:pPr>
+      <w:r>
+        <w:rPr>
+          <w:rFonts w:ascii="Arial" w:cs="Arial" w:eastAsia="Arial" w:hAnsi="Arial"/>
+          <w:color w:val="1A1A2E"/>
+          <w:sz w:val="20"/>
+          <w:szCs w:val="20"/>
+        </w:rPr>
+        <w:t xml:space="preserve">Open the app in a Chromium-based browser (Chrome or Edge).</w:t>
+      </w:r>
+    </w:p>
+    <w:p>
+      <w:pPr>
+        <w:pStyle w:val="ListParagraph"/>
+        <w:numPr>
+          <w:ilvl w:val="0"/>
+          <w:numId w:val="3"/>
+        </w:numPr>
+        <w:spacing w:after="40" w:before="40"/>
+      </w:pPr>
+      <w:r>
+        <w:rPr>
+          <w:rFonts w:ascii="Arial" w:cs="Arial" w:eastAsia="Arial" w:hAnsi="Arial"/>
+          <w:color w:val="1A1A2E"/>
+          <w:sz w:val="20"/>
+          <w:szCs w:val="20"/>
+        </w:rPr>
+        <w:t xml:space="preserve">In the address bar, click the install icon (or use the browser menu → Install app).</w:t>
+      </w:r>
+    </w:p>
+    <w:p>
+      <w:pPr>
+        <w:pStyle w:val="ListParagraph"/>
+        <w:numPr>
+          <w:ilvl w:val="0"/>
+          <w:numId w:val="3"/>
+        </w:numPr>
+        <w:spacing w:after="40" w:before="40"/>
+      </w:pPr>
+      <w:r>
+        <w:rPr>
+          <w:rFonts w:ascii="Arial" w:cs="Arial" w:eastAsia="Arial" w:hAnsi="Arial"/>
+          <w:color w:val="1A1A2E"/>
+          <w:sz w:val="20"/>
+          <w:szCs w:val="20"/>
+        </w:rPr>
+        <w:t xml:space="preserve">Confirm installation to add it to your desktop or start menu.</w:t>
+      </w:r>
+    </w:p>
+    <w:p>
+      <w:pPr>
+        <w:pStyle w:val="Heading2"/>
+        <w:spacing w:after="80" w:before="220"/>
+      </w:pPr>
+      <w:r>
+        <w:rPr>
+          <w:rFonts w:ascii="Arial" w:cs="Arial" w:eastAsia="Arial" w:hAnsi="Arial"/>
+          <w:b/>
+          <w:bCs/>
+          <w:color w:val="2E86C1"/>
+          <w:sz w:val="24"/>
+          <w:szCs w:val="24"/>
+        </w:rPr>
+        <w:t xml:space="preserve">Enable Offline Use</w:t>
+      </w:r>
+    </w:p>
+    <w:p>
+      <w:pPr>
+        <w:spacing w:after="60" w:before="60"/>
+      </w:pPr>
+      <w:r>
+        <w:rPr>
+          <w:rFonts w:ascii="Arial" w:cs="Arial" w:eastAsia="Arial" w:hAnsi="Arial"/>
+          <w:color w:val="1A1A2E"/>
+          <w:sz w:val="20"/>
+          <w:szCs w:val="20"/>
+        </w:rPr>
+        <w:t xml:space="preserve">While online, visit the following key pages at least once to allow the service worker to cache them:</w:t>
+      </w:r>
+    </w:p>
+    <w:p>
+      <w:pPr>
+        <w:pStyle w:val="ListParagraph"/>
+        <w:numPr>
+          <w:ilvl w:val="0"/>
+          <w:numId w:val="2"/>
+        </w:numPr>
+        <w:spacing w:after="40" w:before="40"/>
+      </w:pPr>
+      <w:r>
+        <w:rPr>
+          <w:rFonts w:ascii="Arial" w:cs="Arial" w:eastAsia="Arial" w:hAnsi="Arial"/>
+          <w:color w:val="1A1A2E"/>
+          <w:sz w:val="20"/>
+          <w:szCs w:val="20"/>
+        </w:rPr>
+        <w:t xml:space="preserve">/dashboard/</w:t>
+      </w:r>
+    </w:p>
+    <w:p>
+      <w:pPr>
+        <w:pStyle w:val="ListParagraph"/>
+        <w:numPr>
+          <w:ilvl w:val="0"/>
+          <w:numId w:val="2"/>
+        </w:numPr>
+        <w:spacing w:after="40" w:before="40"/>
+      </w:pPr>
+      <w:r>
+        <w:rPr>
+          <w:rFonts w:ascii="Arial" w:cs="Arial" w:eastAsia="Arial" w:hAnsi="Arial"/>
+          <w:color w:val="1A1A2E"/>
+          <w:sz w:val="20"/>
+          <w:szCs w:val="20"/>
+        </w:rPr>
+        <w:t xml:space="preserve">/products/</w:t>
+      </w:r>
+    </w:p>
+    <w:p>
+      <w:pPr>
+        <w:pStyle w:val="ListParagraph"/>
+        <w:numPr>
+          <w:ilvl w:val="0"/>
+          <w:numId w:val="2"/>
+        </w:numPr>
+        <w:spacing w:after="40" w:before="40"/>
+      </w:pPr>
+      <w:r>
+        <w:rPr>
+          <w:rFonts w:ascii="Arial" w:cs="Arial" w:eastAsia="Arial" w:hAnsi="Arial"/>
+          <w:color w:val="1A1A2E"/>
+          <w:sz w:val="20"/>
+          <w:szCs w:val="20"/>
+        </w:rPr>
+        <w:t xml:space="preserve">/sales/</w:t>
+      </w:r>
+    </w:p>
+    <w:p>
+      <w:pPr>
+        <w:pStyle w:val="ListParagraph"/>
+        <w:numPr>
+          <w:ilvl w:val="0"/>
+          <w:numId w:val="2"/>
+        </w:numPr>
+        <w:spacing w:after="40" w:before="40"/>
+      </w:pPr>
+      <w:r>
+        <w:rPr>
+          <w:rFonts w:ascii="Arial" w:cs="Arial" w:eastAsia="Arial" w:hAnsi="Arial"/>
+          <w:color w:val="1A1A2E"/>
+          <w:sz w:val="20"/>
+          <w:szCs w:val="20"/>
+        </w:rPr>
+        <w:t xml:space="preserve">/reports/daily/</w:t>
+      </w:r>
+    </w:p>
+    <w:p>
+      <w:pPr>
+        <w:spacing w:after="60" w:before="60"/>
+      </w:pPr>
+      <w:r>
+        <w:rPr>
+          <w:rFonts w:ascii="Arial" w:cs="Arial" w:eastAsia="Arial" w:hAnsi="Arial"/>
+          <w:color w:val="1A1A2E"/>
+          <w:sz w:val="20"/>
+          <w:szCs w:val="20"/>
+        </w:rPr>
+        <w:t xml:space="preserve">After caching, these pages remain accessible even when the dev server is stopped or connectivity is lost.</w:t>
+      </w:r>
+    </w:p>
+    <w:p>
+      <w:pPr>
+        <w:pStyle w:val="Heading2"/>
+        <w:spacing w:after="80" w:before="220"/>
+      </w:pPr>
+      <w:r>
+        <w:rPr>
+          <w:rFonts w:ascii="Arial" w:cs="Arial" w:eastAsia="Arial" w:hAnsi="Arial"/>
+          <w:b/>
+          <w:bCs/>
+          <w:color w:val="2E86C1"/>
+          <w:sz w:val="24"/>
+          <w:szCs w:val="24"/>
+        </w:rPr>
+        <w:t xml:space="preserve">Offline Behavior Notes</w:t>
+      </w:r>
+    </w:p>
+    <w:p>
+      <w:pPr>
+        <w:pStyle w:val="ListParagraph"/>
+        <w:numPr>
+          <w:ilvl w:val="0"/>
+          <w:numId w:val="2"/>
+        </w:numPr>
+        <w:spacing w:after="40" w:before="40"/>
+      </w:pPr>
+      <w:r>
+        <w:rPr>
+          <w:rFonts w:ascii="Arial" w:cs="Arial" w:eastAsia="Arial" w:hAnsi="Arial"/>
+          <w:color w:val="1A1A2E"/>
+          <w:sz w:val="20"/>
+          <w:szCs w:val="20"/>
+        </w:rPr>
+        <w:t xml:space="preserve">Cached pages can be opened while offline.</w:t>
+      </w:r>
+    </w:p>
+    <w:p>
+      <w:pPr>
+        <w:pStyle w:val="ListParagraph"/>
+        <w:numPr>
+          <w:ilvl w:val="0"/>
+          <w:numId w:val="2"/>
+        </w:numPr>
+        <w:spacing w:after="40" w:before="40"/>
+      </w:pPr>
+      <w:r>
+        <w:rPr>
+          <w:rFonts w:ascii="Arial" w:cs="Arial" w:eastAsia="Arial" w:hAnsi="Arial"/>
+          <w:color w:val="1A1A2E"/>
+          <w:sz w:val="20"/>
+          <w:szCs w:val="20"/>
+        </w:rPr>
+        <w:t xml:space="preserve">Actions requiring backend or database processing (e.g. creating a new sale or login validation) still require a live server connection.</w:t>
+      </w:r>
+    </w:p>
+    <w:p>
+      <w:pPr>
+        <w:pStyle w:val="ListParagraph"/>
+        <w:numPr>
+          <w:ilvl w:val="0"/>
+          <w:numId w:val="2"/>
+        </w:numPr>
+        <w:spacing w:after="40" w:before="40"/>
+      </w:pPr>
+      <w:r>
+        <w:rPr>
+          <w:rFonts w:ascii="Arial" w:cs="Arial" w:eastAsia="Arial" w:hAnsi="Arial"/>
+          <w:color w:val="1A1A2E"/>
+          <w:sz w:val="20"/>
+          <w:szCs w:val="20"/>
+        </w:rPr>
+        <w:t xml:space="preserve">If old service worker behavior appears, clear site data and re-open the app once while online.</w:t>
+      </w:r>
+    </w:p>
+    <w:p>
+      <w:pPr>
+        <w:spacing w:after="60" w:before="80"/>
+      </w:pPr>
+    </w:p>
+    <w:p>
+      <w:pPr>
+        <w:pBdr>
+          <w:bottom w:val="single" w:sz="4" w:space="1" w:color="D0DCF0"/>
+        </w:pBdr>
+        <w:spacing w:after="120" w:before="120"/>
+      </w:pPr>
     </w:p>
     <w:sectPr>
       <w:headerReference w:type="default" r:id="rId7"/>

</xml_diff>